<commit_message>
Newsletter neu gebaut 09.09.2026
</commit_message>
<xml_diff>
--- a/download/studien-aktuell.docx
+++ b/download/studien-aktuell.docx
@@ -136,7 +136,7 @@
         <w:pStyle w:val="Heading2"/>
       </w:pPr>
       <w:r>
-        <w:t>Capillary refill time crosses diagnostic threshold during acute inflammation: quantitative bedside test unreliable for sepsis alone</w:t>
+        <w:t>Rekapillarisierungszeit bei akuter Entzündung: bettseitiger Test allein nicht sepsistauglich</w:t>
       </w:r>
     </w:p>
     <w:p>
@@ -151,7 +151,7 @@
     </w:p>
     <w:p>
       <w:r>
-        <w:t>Prospective human endotoxemia model (n=25): quantitative capillary refill time (qCRT) during E. coli LPS-induced systemic inflammation showed biphasic trajectory crossing the clinical 3-second threshold in both directions.</w:t>
+        <w:t>Prospektives humanes Endotoxämie-Modell (n=25): Die quantitativ gemessene Rekapillarisierungszeit (qCRT) durchlief unter LPS-induzierter systemischer Entzündung einen zweiphasigen Verlauf und überschritt den klinischen Schwellenwert von drei Sekunden in beide Richtungen.</w:t>
       </w:r>
     </w:p>
     <w:p>
@@ -162,7 +162,7 @@
         <w:t xml:space="preserve">Ergebnis: </w:t>
       </w:r>
       <w:r>
-        <w:t>qCRT prolonged from baseline ~3,5s to 8,31s at 1,5h (14/25 reached 10s ceiling), then shortened to 1,27s at 5h; between-subject variance minor (ICC 0,30); skin temperature explained largest qCRT variance. Findings show single fixed-threshold qCRT unreliable; serial measurement within patient more informative than population threshold.</w:t>
+        <w:t>Die qCRT stieg von etwa 3,5 s zu Beginn auf 8,31 s nach 1,5 Stunden (bei 14 von 25 Probanden wurde die Messobergrenze von 10 s erreicht) und fiel nach 5 Stunden auf 1,27 s. Die Streuung zwischen den Probanden war gering (ICC 0,30); den größten Anteil an der Varianz erklärte die Hauttemperatur. Ein einzelner fester Schwellenwert ist damit nicht verlässlich; die wiederholte Messung am selben Patienten sagt mehr aus als ein Populationsgrenzwert.</w:t>
       </w:r>
     </w:p>
     <w:p>

</xml_diff>